<commit_message>
Add 10 harden interface budget flow
</commit_message>
<xml_diff>
--- a/soc_sdc_work/SoC_SDC_结构说明.docx
+++ b/soc_sdc_work/SoC_SDC_结构说明.docx
@@ -402,118 +402,21 @@
             <w:shd w:fill="FFFFFF"/>
           </w:tcPr>
           <w:p>
-            <w:pPr>
-              <w:spacing w:before="0" w:after="0" w:line="264" w:lineRule="auto"/>
-            </w:pPr>
             <w:r>
-              <w:rPr>
-                <w:noProof/>
-              </w:rPr>
-            </w:r>
-            <w:r>
-              <w:rPr>
-                <w:rFonts w:ascii="Consolas" w:hAnsi="Consolas" w:cs="Consolas" w:eastAsia="宋体"/>
-                <w:b w:val="0"/>
-                <w:color w:val="202020"/>
-                <w:sz w:val="18"/>
-                <w:noProof/>
-              </w:rPr>
               <w:t>01_soc_clocks.sdc</w:t>
-            </w:r>
-            <w:r>
-              <w:rPr>
-                <w:noProof/>
-              </w:rPr>
               <w:br/>
-            </w:r>
-            <w:r>
-              <w:rPr>
-                <w:rFonts w:ascii="Consolas" w:hAnsi="Consolas" w:cs="Consolas" w:eastAsia="宋体"/>
-                <w:b w:val="0"/>
-                <w:color w:val="202020"/>
-                <w:sz w:val="18"/>
-                <w:noProof/>
-              </w:rPr>
               <w:t>02_soc_clock_timing_&lt;stage&gt;_&lt;corner&gt;.sdc</w:t>
-            </w:r>
-            <w:r>
-              <w:rPr>
-                <w:noProof/>
-              </w:rPr>
               <w:br/>
-            </w:r>
-            <w:r>
-              <w:rPr>
-                <w:rFonts w:ascii="Consolas" w:hAnsi="Consolas" w:cs="Consolas" w:eastAsia="宋体"/>
-                <w:b w:val="0"/>
-                <w:color w:val="202020"/>
-                <w:sz w:val="18"/>
-                <w:noProof/>
-              </w:rPr>
               <w:t>03_soc_clock_groups.sdc</w:t>
-            </w:r>
-            <w:r>
-              <w:rPr>
-                <w:noProof/>
-              </w:rPr>
               <w:br/>
-            </w:r>
-            <w:r>
-              <w:rPr>
-                <w:rFonts w:ascii="Consolas" w:hAnsi="Consolas" w:cs="Consolas" w:eastAsia="宋体"/>
-                <w:b w:val="0"/>
-                <w:color w:val="202020"/>
-                <w:sz w:val="18"/>
-                <w:noProof/>
-              </w:rPr>
               <w:t>04_soc_io_pads.sdc</w:t>
-            </w:r>
-            <w:r>
-              <w:rPr>
-                <w:noProof/>
-              </w:rPr>
               <w:br/>
-            </w:r>
-            <w:r>
-              <w:rPr>
-                <w:rFonts w:ascii="Consolas" w:hAnsi="Consolas" w:cs="Consolas" w:eastAsia="宋体"/>
-                <w:b w:val="0"/>
-                <w:color w:val="202020"/>
-                <w:sz w:val="18"/>
-                <w:noProof/>
-              </w:rPr>
               <w:t>10_harden_x_if.sdc</w:t>
-            </w:r>
-            <w:r>
-              <w:rPr>
-                <w:noProof/>
-              </w:rPr>
               <w:br/>
-            </w:r>
-            <w:r>
-              <w:rPr>
-                <w:rFonts w:ascii="Consolas" w:hAnsi="Consolas" w:cs="Consolas" w:eastAsia="宋体"/>
-                <w:b w:val="0"/>
-                <w:color w:val="202020"/>
-                <w:sz w:val="18"/>
-                <w:noProof/>
-              </w:rPr>
+              <w:t>10_harden_x_if_&lt;stage&gt;_&lt;corner&gt;.sdc  # optional view-specific interface budget</w:t>
+              <w:br/>
               <w:t>20_harden_to_harden_exception.sdc</w:t>
-            </w:r>
-            <w:r>
-              <w:rPr>
-                <w:noProof/>
-              </w:rPr>
               <w:br/>
-            </w:r>
-            <w:r>
-              <w:rPr>
-                <w:rFonts w:ascii="Consolas" w:hAnsi="Consolas" w:cs="Consolas" w:eastAsia="宋体"/>
-                <w:b w:val="0"/>
-                <w:color w:val="202020"/>
-                <w:sz w:val="18"/>
-                <w:noProof/>
-              </w:rPr>
               <w:t>30_feedthrough.sdc</w:t>
             </w:r>
           </w:p>
@@ -566,102 +469,21 @@
             <w:shd w:fill="FFFFFF"/>
           </w:tcPr>
           <w:p>
-            <w:pPr>
-              <w:spacing w:before="0" w:after="0" w:line="264" w:lineRule="auto"/>
-            </w:pPr>
             <w:r>
-              <w:rPr>
-                <w:noProof/>
-              </w:rPr>
-            </w:r>
-            <w:r>
-              <w:rPr>
-                <w:rFonts w:ascii="Consolas" w:hAnsi="Consolas" w:cs="Consolas" w:eastAsia="宋体"/>
-                <w:b w:val="0"/>
-                <w:color w:val="202020"/>
-                <w:sz w:val="18"/>
-                <w:noProof/>
-              </w:rPr>
               <w:t>func.sdc</w:t>
-            </w:r>
-            <w:r>
-              <w:rPr>
-                <w:noProof/>
-              </w:rPr>
               <w:br/>
-            </w:r>
-            <w:r>
-              <w:rPr>
-                <w:rFonts w:ascii="Consolas" w:hAnsi="Consolas" w:cs="Consolas" w:eastAsia="宋体"/>
-                <w:b w:val="0"/>
-                <w:color w:val="202020"/>
-                <w:sz w:val="18"/>
-                <w:noProof/>
-              </w:rPr>
               <w:t>&lt;scenario&gt;_clock_timing_&lt;stage&gt;_&lt;corner&gt;.sdc</w:t>
-            </w:r>
-            <w:r>
-              <w:rPr>
-                <w:noProof/>
-              </w:rPr>
               <w:br/>
-            </w:r>
-            <w:r>
-              <w:rPr>
-                <w:rFonts w:ascii="Consolas" w:hAnsi="Consolas" w:cs="Consolas" w:eastAsia="宋体"/>
-                <w:b w:val="0"/>
-                <w:color w:val="202020"/>
-                <w:sz w:val="18"/>
-                <w:noProof/>
-              </w:rPr>
+              <w:t>&lt;scenario&gt;_harden_x_if.sdc  # optional scenario interface budget</w:t>
+              <w:br/>
+              <w:t>&lt;scenario&gt;_harden_x_if_&lt;stage&gt;_&lt;corner&gt;.sdc  # optional scenario/view interface budget</w:t>
+              <w:br/>
               <w:t>dft_scan.sdc</w:t>
-            </w:r>
-            <w:r>
-              <w:rPr>
-                <w:noProof/>
-              </w:rPr>
               <w:br/>
-            </w:r>
-            <w:r>
-              <w:rPr>
-                <w:rFonts w:ascii="Consolas" w:hAnsi="Consolas" w:cs="Consolas" w:eastAsia="宋体"/>
-                <w:b w:val="0"/>
-                <w:color w:val="202020"/>
-                <w:sz w:val="18"/>
-                <w:noProof/>
-              </w:rPr>
               <w:t>mbist.sdc</w:t>
-            </w:r>
-            <w:r>
-              <w:rPr>
-                <w:noProof/>
-              </w:rPr>
               <w:br/>
-            </w:r>
-            <w:r>
-              <w:rPr>
-                <w:rFonts w:ascii="Consolas" w:hAnsi="Consolas" w:cs="Consolas" w:eastAsia="宋体"/>
-                <w:b w:val="0"/>
-                <w:color w:val="202020"/>
-                <w:sz w:val="18"/>
-                <w:noProof/>
-              </w:rPr>
               <w:t>gpio_in.sdc</w:t>
-            </w:r>
-            <w:r>
-              <w:rPr>
-                <w:noProof/>
-              </w:rPr>
               <w:br/>
-            </w:r>
-            <w:r>
-              <w:rPr>
-                <w:rFonts w:ascii="Consolas" w:hAnsi="Consolas" w:cs="Consolas" w:eastAsia="宋体"/>
-                <w:b w:val="0"/>
-                <w:color w:val="202020"/>
-                <w:sz w:val="18"/>
-                <w:noProof/>
-              </w:rPr>
               <w:t>gpio_out.sdc</w:t>
             </w:r>
           </w:p>
@@ -708,28 +530,7 @@
               <w:spacing w:before="80" w:after="140" w:line="276" w:lineRule="auto"/>
             </w:pPr>
             <w:r>
-              <w:rPr>
-                <w:noProof/>
-              </w:rPr>
-            </w:r>
-            <w:r>
-              <w:rPr>
-                <w:rFonts w:ascii="Arial" w:hAnsi="Arial" w:cs="Arial" w:eastAsia="黑体"/>
-                <w:b/>
-                <w:color w:val="202020"/>
-                <w:sz w:val="20"/>
-                <w:noProof/>
-              </w:rPr>
-              <w:t>核心原则：</w:t>
-            </w:r>
-            <w:r>
-              <w:rPr>
-                <w:rFonts w:ascii="Times New Roman" w:hAnsi="Times New Roman" w:cs="Times New Roman" w:eastAsia="宋体"/>
-                <w:color w:val="202020"/>
-                <w:sz w:val="20"/>
-                <w:noProof/>
-              </w:rPr>
-              <w:t>clock 创建统一放 01；clock timing budget 放 02；clock relationship 放 03；IO 环境放 04；harden interface、feedthrough、path exception 分别放 10/30/20。</w:t>
+              <w:t>核心原则：clock 创建统一放 01；clock timing budget 放 02；clock relationship 放 03；IO 环境放 04；普通 harden/subsys interface budget 放 10；exception 性质的 path 语义改写放 20；feedthrough 放 30。</w:t>
             </w:r>
           </w:p>
         </w:tc>
@@ -1320,41 +1121,9 @@
               <w:spacing w:before="0" w:after="0" w:line="259" w:lineRule="auto"/>
             </w:pPr>
             <w:r>
-              <w:rPr>
-                <w:rFonts w:ascii="Times New Roman" w:hAnsi="Times New Roman" w:cs="Times New Roman" w:eastAsia="宋体"/>
-                <w:color w:val="202020"/>
-                <w:sz w:val="18"/>
-                <w:noProof/>
-              </w:rPr>
-            </w:r>
-            <w:r>
-              <w:rPr>
-                <w:rFonts w:ascii="Times New Roman" w:hAnsi="Times New Roman" w:eastAsia="宋体" w:cs="Times New Roman"/>
-                <w:b w:val="0"/>
-                <w:color w:val="202020"/>
-                <w:sz w:val="18"/>
-                <w:noProof/>
-              </w:rPr>
               <w:t>Top IO/pad environment：input/output delay、driving_cell/drive、load、input_transition、IO design rule。</w:t>
-            </w:r>
-            <w:r>
-              <w:rPr>
-                <w:rFonts w:ascii="Times New Roman" w:hAnsi="Times New Roman" w:cs="Times New Roman" w:eastAsia="宋体"/>
-                <w:color w:val="202020"/>
-                <w:sz w:val="18"/>
-                <w:noProof/>
-              </w:rPr>
               <w:br/>
-            </w:r>
-            <w:r>
-              <w:rPr>
-                <w:rFonts w:ascii="Times New Roman" w:hAnsi="Times New Roman" w:eastAsia="宋体" w:cs="Times New Roman"/>
-                <w:b w:val="0"/>
-                <w:color w:val="202020"/>
-                <w:sz w:val="18"/>
-                <w:noProof/>
-              </w:rPr>
-              <w:t>引用 01 virtual clock；GPIO/inout 方向依赖下沉场景；不创建 clock。</w:t>
+              <w:t>引用 01 已创建的 clock object（virtual/real/generated/forwarded）；GPIO/inout 方向依赖下沉场景；不创建 clock。</w:t>
             </w:r>
           </w:p>
         </w:tc>
@@ -1433,45 +1202,12 @@
             <w:shd w:fill="FFFFFF"/>
           </w:tcPr>
           <w:p>
-            <w:pPr>
-              <w:spacing w:before="0" w:after="0" w:line="259" w:lineRule="auto"/>
-            </w:pPr>
             <w:r>
-              <w:rPr>
-                <w:rFonts w:ascii="Times New Roman" w:hAnsi="Times New Roman" w:cs="Times New Roman" w:eastAsia="宋体"/>
-                <w:color w:val="202020"/>
-                <w:sz w:val="18"/>
-                <w:noProof/>
-              </w:rPr>
-            </w:r>
-            <w:r>
-              <w:rPr>
-                <w:rFonts w:ascii="Times New Roman" w:hAnsi="Times New Roman" w:eastAsia="宋体" w:cs="Times New Roman"/>
-                <w:b w:val="0"/>
-                <w:color w:val="202020"/>
-                <w:sz w:val="18"/>
-                <w:noProof/>
-              </w:rPr>
-              <w:t>SoC 视角的 harden interface 约束：边界 pin group、公共接口 timing、harden integration SDC 可提升到 SoC 级的边界约束。</w:t>
-            </w:r>
-            <w:r>
-              <w:rPr>
-                <w:rFonts w:ascii="Times New Roman" w:hAnsi="Times New Roman" w:cs="Times New Roman" w:eastAsia="宋体"/>
-                <w:color w:val="202020"/>
-                <w:sz w:val="18"/>
-                <w:noProof/>
-              </w:rPr>
+              <w:t>SoC 视角的 harden/subsys interface timing budget：从 integration SDC 或 subsys 非 pad set_input/output_delay 提取候选，经连接关系、clock 映射和 review 后生成 boundary-to-boundary budget，优先使用 set_max/min_delay。</w:t>
               <w:br/>
-            </w:r>
-            <w:r>
-              <w:rPr>
-                <w:rFonts w:ascii="Times New Roman" w:hAnsi="Times New Roman" w:eastAsia="宋体" w:cs="Times New Roman"/>
-                <w:b w:val="0"/>
-                <w:color w:val="202020"/>
-                <w:sz w:val="18"/>
-                <w:noProof/>
-              </w:rPr>
-              <w:t>不是 harden 内部 full SDC；不放 harden-to-harden exception。</w:t>
+              <w:t>若 budget 依赖 stage/corner，可拆出 common/10_harden_x_if_&lt;stage&gt;_&lt;corner&gt;.sdc；若依赖 scenario，则放 scenario overlay。</w:t>
+              <w:br/>
+              <w:t>不直接 source harden 内部 full SDC；不机械把 set_input/output_delay 改到 instance pin；不放 exception，也不放 SoC top pad IO 环境。</w:t>
             </w:r>
           </w:p>
         </w:tc>
@@ -1574,41 +1310,9 @@
               <w:spacing w:before="0" w:after="0" w:line="259" w:lineRule="auto"/>
             </w:pPr>
             <w:r>
-              <w:rPr>
-                <w:rFonts w:ascii="Times New Roman" w:hAnsi="Times New Roman" w:cs="Times New Roman" w:eastAsia="宋体"/>
-                <w:color w:val="202020"/>
-                <w:sz w:val="18"/>
-                <w:noProof/>
-              </w:rPr>
-            </w:r>
-            <w:r>
-              <w:rPr>
-                <w:rFonts w:ascii="Times New Roman" w:hAnsi="Times New Roman" w:eastAsia="宋体" w:cs="Times New Roman"/>
-                <w:b w:val="0"/>
-                <w:color w:val="202020"/>
-                <w:sz w:val="18"/>
-                <w:noProof/>
-              </w:rPr>
-              <w:t>Harden A 到 Harden B 的 common path exception：false_path、multicycle、max/min delay。</w:t>
-            </w:r>
-            <w:r>
-              <w:rPr>
-                <w:rFonts w:ascii="Times New Roman" w:hAnsi="Times New Roman" w:cs="Times New Roman" w:eastAsia="宋体"/>
-                <w:color w:val="202020"/>
-                <w:sz w:val="18"/>
-                <w:noProof/>
-              </w:rPr>
+              <w:t>Harden A 到 Harden B 的 common path exception：false_path、multicycle，以及 exception 性质的 set_max/min_delay override，例如 async handshake、configuration path 或非单周期协议。</w:t>
               <w:br/>
-            </w:r>
-            <w:r>
-              <w:rPr>
-                <w:rFonts w:ascii="Times New Roman" w:hAnsi="Times New Roman" w:eastAsia="宋体" w:cs="Times New Roman"/>
-                <w:b w:val="0"/>
-                <w:color w:val="202020"/>
-                <w:sz w:val="18"/>
-                <w:noProof/>
-              </w:rPr>
-              <w:t>高风险；只放所有 mode 都成立且有架构依据的 exception，不能用于单纯清 violation。</w:t>
+              <w:t>高风险；只放所有 mode 都成立且有架构依据的 STA 语义改写。普通 interface budget 归 10，不能用于单纯清 violation。</w:t>
             </w:r>
           </w:p>
         </w:tc>
@@ -3200,22 +2904,7 @@
               <w:spacing w:before="0" w:after="0" w:line="259" w:lineRule="auto"/>
             </w:pPr>
             <w:r>
-              <w:rPr>
-                <w:rFonts w:ascii="Times New Roman" w:hAnsi="Times New Roman" w:cs="Times New Roman" w:eastAsia="宋体"/>
-                <w:color w:val="202020"/>
-                <w:sz w:val="18"/>
-                <w:noProof/>
-              </w:rPr>
-            </w:r>
-            <w:r>
-              <w:rPr>
-                <w:rFonts w:ascii="Times New Roman" w:hAnsi="Times New Roman" w:eastAsia="宋体" w:cs="Times New Roman"/>
-                <w:b w:val="0"/>
-                <w:color w:val="202020"/>
-                <w:sz w:val="18"/>
-                <w:noProof/>
-              </w:rPr>
-              <w:t>source common/04，再 source scenario IO overlay。</w:t>
+              <w:t>source common/04；如存在 view-specific IO 电气约束，再 source common/04_&lt;stage&gt;_&lt;corner&gt;；最后 source scenario IO overlay。</w:t>
             </w:r>
           </w:p>
         </w:tc>
@@ -3310,26 +2999,8 @@
             <w:shd w:fill="FFFFFF"/>
           </w:tcPr>
           <w:p>
-            <w:pPr>
-              <w:spacing w:before="0" w:after="0" w:line="259" w:lineRule="auto"/>
-            </w:pPr>
             <w:r>
-              <w:rPr>
-                <w:rFonts w:ascii="Times New Roman" w:hAnsi="Times New Roman" w:cs="Times New Roman" w:eastAsia="宋体"/>
-                <w:color w:val="202020"/>
-                <w:sz w:val="18"/>
-                <w:noProof/>
-              </w:rPr>
-            </w:r>
-            <w:r>
-              <w:rPr>
-                <w:rFonts w:ascii="Times New Roman" w:hAnsi="Times New Roman" w:eastAsia="宋体" w:cs="Times New Roman"/>
-                <w:b w:val="0"/>
-                <w:color w:val="202020"/>
-                <w:sz w:val="18"/>
-                <w:noProof/>
-              </w:rPr>
-              <w:t>source common/10、common/30，再追加 scenario overlay。</w:t>
+              <w:t>先 source common/10_harden_x_if.sdc；如存在 view-specific interface budget，再 source common/10_harden_x_if_&lt;stage&gt;_&lt;corner&gt;.sdc；然后 source common/30_feedthrough.sdc，最后追加 scenario harden_x_if/feedthrough overlay。</w:t>
             </w:r>
           </w:p>
         </w:tc>
@@ -3924,13 +3595,7 @@
       <w:jc w:val="right"/>
     </w:pPr>
     <w:r>
-      <w:rPr>
-        <w:rFonts w:ascii="Arial" w:hAnsi="Arial" w:eastAsia="黑体" w:cs="Arial"/>
-        <w:color w:val="646464"/>
-        <w:sz w:val="17"/>
-        <w:noProof/>
-      </w:rPr>
-      <w:t>当前工作版 | 2026-06-16</w:t>
+      <w:t>当前工作版 | 2026-06-22</w:t>
     </w:r>
   </w:p>
 </w:ftr>

</xml_diff>